<commit_message>
v1.0: case-insensitive placeholders, CAPS conversion, improved error handling
- Placeholders now case-insensitive ({{АДРЕС}} = {{адрес}})
- All inserted text converted to uppercase
- Removed green highlighting on replacements
- Better error messages in Russian for users
- Template matches original format exactly
- Example table updated with 127 real records from colleagues
- File naming: Surname_IO_Organization.docx
</commit_message>
<xml_diff>
--- a/word_templates/primer_shablona.docx
+++ b/word_templates/primer_shablona.docx
@@ -4,39 +4,459 @@
   <w:body>
     <w:p>
       <w:pPr>
+        <w:spacing w:after="0" w:before="0" w:line="276" w:lineRule="auto"/>
         <w:jc w:val="both"/>
-        <w:tabs>
-          <w:tab w:val="right" w:pos="9360"/>
-        </w:tabs>
       </w:pPr>
       <w:r>
         <w:rPr>
-          <w:rFonts w:ascii="Times New Roman" w:hAnsi="Times New Roman"/>
+          <w:rFonts w:ascii="Times New Roman" w:hAnsi="Times New Roman" w:eastAsia="Times New Roman"/>
+          <w:b w:val="0"/>
           <w:sz w:val="24"/>
         </w:rPr>
-        <w:tab/>
-      </w:r>
-      <w:r>
-        <w:rPr>
-          <w:rFonts w:ascii="Times New Roman" w:hAnsi="Times New Roman"/>
-          <w:sz w:val="24"/>
-        </w:rPr>
-        <w:t>{{адрес}}</w:t>
+        <w:t>{{АДРЕС}}</w:t>
       </w:r>
     </w:p>
     <w:p>
       <w:pPr>
+        <w:spacing w:after="0" w:before="0" w:line="276" w:lineRule="auto"/>
         <w:jc w:val="both"/>
-        <w:tabs>
-          <w:tab w:val="right" w:pos="9360"/>
-        </w:tabs>
       </w:pPr>
       <w:r>
         <w:rPr>
-          <w:rFonts w:ascii="Times New Roman" w:hAnsi="Times New Roman"/>
+          <w:rFonts w:ascii="Times New Roman" w:hAnsi="Times New Roman" w:eastAsia="Times New Roman"/>
+          <w:b w:val="0"/>
           <w:sz w:val="24"/>
         </w:rPr>
+        <w:t>{{ОРГАНИЗАЦИЯ}}</w:t>
+      </w:r>
+    </w:p>
+    <w:p>
+      <w:pPr>
+        <w:spacing w:after="0" w:before="0" w:line="276" w:lineRule="auto"/>
+        <w:jc w:val="both"/>
+      </w:pPr>
+      <w:r>
+        <w:rPr>
+          <w:rFonts w:ascii="Times New Roman" w:hAnsi="Times New Roman" w:eastAsia="Times New Roman"/>
+          <w:b w:val="0"/>
+          <w:sz w:val="24"/>
+        </w:rPr>
+        <w:t>{{ДОЛЖНОСТЬ_ДАТ}}</w:t>
+      </w:r>
+    </w:p>
+    <w:p>
+      <w:pPr>
+        <w:spacing w:after="0" w:before="0" w:line="276" w:lineRule="auto"/>
+        <w:jc w:val="both"/>
+      </w:pPr>
+      <w:r>
+        <w:rPr>
+          <w:rFonts w:ascii="Times New Roman" w:hAnsi="Times New Roman" w:eastAsia="Times New Roman"/>
+          <w:b w:val="0"/>
+          <w:sz w:val="24"/>
+        </w:rPr>
+        <w:t>{{ФИО_ДАТ}}</w:t>
+      </w:r>
+    </w:p>
+    <w:p>
+      <w:pPr>
+        <w:spacing w:after="0" w:before="0" w:line="276" w:lineRule="auto"/>
+        <w:jc w:val="both"/>
+      </w:pPr>
+      <w:r>
+        <w:rPr>
+          <w:rFonts w:ascii="Times New Roman" w:hAnsi="Times New Roman" w:eastAsia="Times New Roman"/>
+          <w:b w:val="0"/>
+          <w:sz w:val="24"/>
+        </w:rPr>
+      </w:r>
+    </w:p>
+    <w:p>
+      <w:pPr>
+        <w:spacing w:after="0" w:before="0" w:line="276" w:lineRule="auto"/>
+        <w:jc w:val="both"/>
+      </w:pPr>
+      <w:r>
+        <w:rPr>
+          <w:rFonts w:ascii="Times New Roman" w:hAnsi="Times New Roman" w:eastAsia="Times New Roman"/>
+          <w:b w:val="0"/>
+          <w:sz w:val="24"/>
+        </w:rPr>
+      </w:r>
+    </w:p>
+    <w:p>
+      <w:pPr>
+        <w:spacing w:after="0" w:before="0" w:line="276" w:lineRule="auto"/>
+        <w:jc w:val="both"/>
+      </w:pPr>
+      <w:r>
+        <w:rPr>
+          <w:rFonts w:ascii="Times New Roman" w:hAnsi="Times New Roman" w:eastAsia="Times New Roman"/>
+          <w:b w:val="0"/>
+          <w:sz w:val="24"/>
+        </w:rPr>
+        <w:t>{{УВАЖАЕМЫЙ}} {{ИМЯ_ОТЧЕСТВО}}!</w:t>
+      </w:r>
+    </w:p>
+    <w:p>
+      <w:pPr>
+        <w:spacing w:after="0" w:before="0" w:line="276" w:lineRule="auto"/>
+        <w:jc w:val="both"/>
+      </w:pPr>
+      <w:r>
+        <w:rPr>
+          <w:rFonts w:ascii="Times New Roman" w:hAnsi="Times New Roman" w:eastAsia="Times New Roman"/>
+          <w:b w:val="0"/>
+          <w:sz w:val="24"/>
+        </w:rPr>
+      </w:r>
+    </w:p>
+    <w:p>
+      <w:pPr>
+        <w:spacing w:after="0" w:before="0" w:line="276" w:lineRule="auto"/>
+        <w:jc w:val="both"/>
+      </w:pPr>
+      <w:r>
+        <w:rPr>
+          <w:rFonts w:ascii="Times New Roman" w:hAnsi="Times New Roman" w:eastAsia="Times New Roman"/>
+          <w:b w:val="0"/>
+          <w:sz w:val="24"/>
+        </w:rPr>
+        <w:t>ПОЗДРАВЛЯЮ ВАС С ДНЁМ ПОБЕДЫ!</w:t>
+      </w:r>
+    </w:p>
+    <w:p>
+      <w:pPr>
+        <w:spacing w:after="0" w:before="0" w:line="276" w:lineRule="auto"/>
+        <w:jc w:val="both"/>
+      </w:pPr>
+      <w:r>
+        <w:rPr>
+          <w:rFonts w:ascii="Times New Roman" w:hAnsi="Times New Roman" w:eastAsia="Times New Roman"/>
+          <w:b w:val="0"/>
+          <w:sz w:val="24"/>
+        </w:rPr>
+        <w:t xml:space="preserve"> </w:t>
+      </w:r>
+    </w:p>
+    <w:p>
+      <w:pPr>
+        <w:spacing w:after="0" w:before="0" w:line="276" w:lineRule="auto"/>
+        <w:jc w:val="both"/>
+      </w:pPr>
+      <w:r>
+        <w:rPr>
+          <w:rFonts w:ascii="Times New Roman" w:hAnsi="Times New Roman" w:eastAsia="Times New Roman"/>
+          <w:b w:val="0"/>
+          <w:sz w:val="24"/>
+        </w:rPr>
+        <w:t>ДЛЯ ВСЕХ НАС ЭТОТ ПРАЗДНИК — ДАНЬ СВЯЩЕННОЙ ПАМЯТИ ТЕМ, КТО ЦЕНОЙ ЖИЗНИ И НЕВЕРОЯТНЫХ УСИЛИЙ ОТСТОЯЛ НЕЗАВИСИМОСТЬ НАШЕЙ СТРАНЫ. ЭТО СИМВОЛ НЕСГИБАЕМОЙ ВОЛИ, СПЛОЧЁННОСТИ И ЛЮБВИ К РОДИНЕ.</w:t>
+      </w:r>
+    </w:p>
+    <w:p>
+      <w:pPr>
+        <w:spacing w:after="0" w:before="0" w:line="276" w:lineRule="auto"/>
+        <w:jc w:val="both"/>
+      </w:pPr>
+      <w:r>
+        <w:rPr>
+          <w:rFonts w:ascii="Times New Roman" w:hAnsi="Times New Roman" w:eastAsia="Times New Roman"/>
+          <w:b w:val="0"/>
+          <w:sz w:val="24"/>
+        </w:rPr>
+        <w:t xml:space="preserve"> </w:t>
+      </w:r>
+    </w:p>
+    <w:p>
+      <w:pPr>
+        <w:spacing w:after="0" w:before="0" w:line="276" w:lineRule="auto"/>
+        <w:jc w:val="both"/>
+      </w:pPr>
+      <w:r>
+        <w:rPr>
+          <w:rFonts w:ascii="Times New Roman" w:hAnsi="Times New Roman" w:eastAsia="Times New Roman"/>
+          <w:b w:val="0"/>
+          <w:sz w:val="24"/>
+        </w:rPr>
+        <w:t xml:space="preserve">МЫ ПОМНИМ О ВЕЛИКОМ ПОДВИГЕ НАРОДА И ГОРДИМСЯ ТЕМ, ЧТО ЯВЛЯЕМСЯ НАСЛЕДНИКАМИ ПОБЕДИТЕЛЕЙ. </w:t>
+      </w:r>
+    </w:p>
+    <w:p>
+      <w:pPr>
+        <w:spacing w:after="0" w:before="0" w:line="276" w:lineRule="auto"/>
+        <w:jc w:val="both"/>
+      </w:pPr>
+      <w:r>
+        <w:rPr>
+          <w:rFonts w:ascii="Times New Roman" w:hAnsi="Times New Roman" w:eastAsia="Times New Roman"/>
+          <w:b w:val="0"/>
+          <w:sz w:val="24"/>
+        </w:rPr>
+        <w:t>СПАСИБО НАШИМ ВЕТЕРАНАМ ЗА МИР, СВОБОДУ И ВОЗМОЖНОСТЬ СТРОИТЬ БУДУЩЕЕ. ИХ ПОДВИГ ЖИВЁТ В НАШИХ СЕРДЦАХ, ПЕРЕДАЁТСЯ ОТ ОТЦОВ К ДЕТЯМ И ЗАДАЁТ НРАВСТВЕННЫЕ ОРИЕНТИРЫ ДЛЯ ВСЕЙ СТРАНЫ.</w:t>
+      </w:r>
+    </w:p>
+    <w:p>
+      <w:pPr>
+        <w:spacing w:after="0" w:before="0" w:line="276" w:lineRule="auto"/>
+        <w:jc w:val="both"/>
+      </w:pPr>
+      <w:r>
+        <w:rPr>
+          <w:rFonts w:ascii="Times New Roman" w:hAnsi="Times New Roman" w:eastAsia="Times New Roman"/>
+          <w:b w:val="0"/>
+          <w:sz w:val="24"/>
+        </w:rPr>
+        <w:t xml:space="preserve"> </w:t>
+      </w:r>
+    </w:p>
+    <w:p>
+      <w:pPr>
+        <w:spacing w:after="0" w:before="0" w:line="276" w:lineRule="auto"/>
+        <w:jc w:val="both"/>
+      </w:pPr>
+      <w:r>
+        <w:rPr>
+          <w:rFonts w:ascii="Times New Roman" w:hAnsi="Times New Roman" w:eastAsia="Times New Roman"/>
+          <w:b w:val="0"/>
+          <w:sz w:val="24"/>
+        </w:rPr>
+        <w:t>ЖЕЛАЮ ВАМ КРЕПКОГО ЗДОРОВЬЯ, СЧАСТЬЯ И БЛАГОПОЛУЧИЯ! ПУСТЬ В КАЖДОМ ДОМЕ ЦАРИТ ТЕПЛО, А ПАМЯТЬ О ВЕЛИКОЙ ПОБЕДЕ ВСЕГДА НАПОЛНЯЕТ НАШИ СЕРДЦА ГОРДОСТЬЮ!</w:t>
+      </w:r>
+    </w:p>
+    <w:p>
+      <w:pPr>
+        <w:spacing w:after="0" w:before="0" w:line="276" w:lineRule="auto"/>
+        <w:jc w:val="both"/>
+      </w:pPr>
+      <w:r>
+        <w:rPr>
+          <w:rFonts w:ascii="Times New Roman" w:hAnsi="Times New Roman" w:eastAsia="Times New Roman"/>
+          <w:b w:val="0"/>
+          <w:sz w:val="24"/>
+        </w:rPr>
+      </w:r>
+    </w:p>
+    <w:p>
+      <w:pPr>
+        <w:spacing w:after="0" w:before="0" w:line="276" w:lineRule="auto"/>
+        <w:jc w:val="both"/>
+      </w:pPr>
+      <w:r>
+        <w:rPr>
+          <w:rFonts w:ascii="Times New Roman" w:hAnsi="Times New Roman" w:eastAsia="Times New Roman"/>
+          <w:b w:val="0"/>
+          <w:sz w:val="24"/>
+        </w:rPr>
+      </w:r>
+    </w:p>
+    <w:p>
+      <w:pPr>
+        <w:spacing w:after="0" w:before="0" w:line="276" w:lineRule="auto"/>
+        <w:jc w:val="both"/>
+      </w:pPr>
+      <w:r>
+        <w:rPr>
+          <w:rFonts w:ascii="Times New Roman" w:hAnsi="Times New Roman" w:eastAsia="Times New Roman"/>
+          <w:b w:val="0"/>
+          <w:sz w:val="24"/>
+        </w:rPr>
+        <w:t>С УВАЖЕНИЕМ,</w:t>
         <w:tab/>
+        <w:tab/>
+        <w:tab/>
+        <w:t xml:space="preserve">                                                                   А. А. ВЕДЯХИН</w:t>
+      </w:r>
+    </w:p>
+    <w:p>
+      <w:pPr>
+        <w:spacing w:after="0" w:before="0" w:line="276" w:lineRule="auto"/>
+        <w:jc w:val="both"/>
+      </w:pPr>
+      <w:r>
+        <w:rPr>
+          <w:rFonts w:ascii="Times New Roman" w:hAnsi="Times New Roman" w:eastAsia="Times New Roman"/>
+          <w:b w:val="0"/>
+          <w:sz w:val="24"/>
+        </w:rPr>
+        <w:t>ПЕРВЫЙ ЗАМЕСТИТЕЛЬ</w:t>
+      </w:r>
+    </w:p>
+    <w:p>
+      <w:pPr>
+        <w:spacing w:after="0" w:before="0" w:line="276" w:lineRule="auto"/>
+        <w:jc w:val="both"/>
+      </w:pPr>
+      <w:r>
+        <w:rPr>
+          <w:rFonts w:ascii="Times New Roman" w:hAnsi="Times New Roman" w:eastAsia="Times New Roman"/>
+          <w:b w:val="0"/>
+          <w:sz w:val="24"/>
+        </w:rPr>
+        <w:t>ПРЕДСЕДАТЕЛЯ ПРАВЛЕНИЯ</w:t>
+      </w:r>
+    </w:p>
+    <w:p>
+      <w:pPr>
+        <w:spacing w:after="0" w:before="0" w:line="276" w:lineRule="auto"/>
+        <w:jc w:val="both"/>
+      </w:pPr>
+      <w:r>
+        <w:rPr>
+          <w:rFonts w:ascii="Times New Roman" w:hAnsi="Times New Roman" w:eastAsia="Times New Roman"/>
+          <w:b w:val="0"/>
+          <w:sz w:val="24"/>
+        </w:rPr>
+        <w:t>ПАО СБЕРБАНК</w:t>
+      </w:r>
+    </w:p>
+    <w:p>
+      <w:pPr>
+        <w:spacing w:after="0" w:before="0" w:line="276" w:lineRule="auto"/>
+        <w:jc w:val="both"/>
+      </w:pPr>
+      <w:r>
+        <w:rPr>
+          <w:rFonts w:ascii="Times New Roman" w:hAnsi="Times New Roman" w:eastAsia="Times New Roman"/>
+          <w:b w:val="0"/>
+          <w:sz w:val="24"/>
+        </w:rPr>
+      </w:r>
+    </w:p>
+    <w:p>
+      <w:pPr>
+        <w:spacing w:after="0" w:before="0" w:line="276" w:lineRule="auto"/>
+        <w:jc w:val="both"/>
+      </w:pPr>
+      <w:r>
+        <w:rPr>
+          <w:rFonts w:ascii="Times New Roman" w:hAnsi="Times New Roman" w:eastAsia="Times New Roman"/>
+          <w:b w:val="0"/>
+          <w:sz w:val="24"/>
+        </w:rPr>
+        <w:t>117997, Г. МОСКВА,</w:t>
+        <w:tab/>
+        <w:t xml:space="preserve">                                                                           4 МАЯ 2026 ГОДА</w:t>
+      </w:r>
+    </w:p>
+    <w:p>
+      <w:pPr>
+        <w:spacing w:after="0" w:before="0" w:line="276" w:lineRule="auto"/>
+        <w:jc w:val="both"/>
+      </w:pPr>
+      <w:r>
+        <w:rPr>
+          <w:rFonts w:ascii="Times New Roman" w:hAnsi="Times New Roman" w:eastAsia="Times New Roman"/>
+          <w:b w:val="0"/>
+          <w:sz w:val="24"/>
+        </w:rPr>
+        <w:t>УЛ. ВАВИЛОВА, Д. 19</w:t>
+      </w:r>
+    </w:p>
+    <w:p>
+      <w:pPr>
+        <w:spacing w:after="0" w:before="0" w:line="276" w:lineRule="auto"/>
+        <w:jc w:val="both"/>
+      </w:pPr>
+      <w:r>
+        <w:rPr>
+          <w:rFonts w:ascii="Times New Roman" w:hAnsi="Times New Roman" w:eastAsia="Times New Roman"/>
+          <w:b w:val="0"/>
+          <w:sz w:val="24"/>
+        </w:rPr>
+      </w:r>
+    </w:p>
+    <w:p>
+      <w:pPr>
+        <w:spacing w:after="0" w:before="0" w:line="276" w:lineRule="auto"/>
+        <w:jc w:val="center"/>
+      </w:pPr>
+      <w:r>
+        <w:rPr>
+          <w:rFonts w:ascii="Times New Roman" w:hAnsi="Times New Roman" w:eastAsia="Times New Roman"/>
+          <w:b w:val="0"/>
+          <w:sz w:val="24"/>
+        </w:rPr>
+        <w:t>═══════════════════════════════════════════════════════════════════</w:t>
+      </w:r>
+    </w:p>
+    <w:p>
+      <w:pPr>
+        <w:spacing w:after="0" w:before="0" w:line="276" w:lineRule="auto"/>
+        <w:jc w:val="center"/>
+      </w:pPr>
+      <w:r>
+        <w:rPr>
+          <w:rFonts w:ascii="Times New Roman" w:hAnsi="Times New Roman" w:eastAsia="Times New Roman"/>
+          <w:b/>
+          <w:sz w:val="24"/>
+        </w:rPr>
+        <w:t>СПРАВКА ПО МЕТКАМ (удалите этот раздел перед использованием)</w:t>
+      </w:r>
+    </w:p>
+    <w:p>
+      <w:pPr>
+        <w:spacing w:after="0" w:before="0" w:line="276" w:lineRule="auto"/>
+        <w:jc w:val="both"/>
+      </w:pPr>
+      <w:r>
+        <w:rPr>
+          <w:rFonts w:ascii="Times New Roman" w:hAnsi="Times New Roman" w:eastAsia="Times New Roman"/>
+          <w:b w:val="0"/>
+          <w:sz w:val="24"/>
+        </w:rPr>
+      </w:r>
+    </w:p>
+    <w:p>
+      <w:pPr>
+        <w:spacing w:after="0" w:before="0" w:line="276" w:lineRule="auto"/>
+        <w:jc w:val="both"/>
+      </w:pPr>
+      <w:r>
+        <w:rPr>
+          <w:rFonts w:ascii="Times New Roman" w:hAnsi="Times New Roman" w:eastAsia="Times New Roman"/>
+          <w:b w:val="0"/>
+          <w:sz w:val="24"/>
+        </w:rPr>
+        <w:t>Метка — текст в двойных фигурных скобках. При генерации метка заменится на данные из Excel.</w:t>
+      </w:r>
+    </w:p>
+    <w:p>
+      <w:pPr>
+        <w:spacing w:after="0" w:before="0" w:line="276" w:lineRule="auto"/>
+        <w:jc w:val="both"/>
+      </w:pPr>
+      <w:r>
+        <w:rPr>
+          <w:rFonts w:ascii="Times New Roman" w:hAnsi="Times New Roman" w:eastAsia="Times New Roman"/>
+          <w:b w:val="0"/>
+          <w:sz w:val="24"/>
+        </w:rPr>
+      </w:r>
+    </w:p>
+    <w:p>
+      <w:pPr>
+        <w:spacing w:after="0" w:before="0" w:line="276" w:lineRule="auto"/>
+        <w:jc w:val="both"/>
+      </w:pPr>
+      <w:r>
+        <w:rPr>
+          <w:rFonts w:ascii="Times New Roman" w:hAnsi="Times New Roman" w:eastAsia="Times New Roman"/>
+          <w:b w:val="0"/>
+          <w:sz w:val="24"/>
+        </w:rPr>
+      </w:r>
+    </w:p>
+    <w:p>
+      <w:pPr>
+        <w:spacing w:after="0" w:before="0" w:line="276" w:lineRule="auto"/>
+        <w:jc w:val="both"/>
+      </w:pPr>
+      <w:r>
+        <w:rPr>
+          <w:rFonts w:ascii="Times New Roman" w:hAnsi="Times New Roman" w:eastAsia="Times New Roman"/>
+          <w:b w:val="0"/>
+          <w:sz w:val="24"/>
+        </w:rPr>
       </w:r>
       <w:r>
         <w:rPr>
@@ -44,591 +464,41 @@
           <w:b/>
           <w:sz w:val="24"/>
         </w:rPr>
-        <w:t>{{организация}}</w:t>
-      </w:r>
-    </w:p>
-    <w:p/>
-    <w:p/>
-    <w:p>
-      <w:pPr>
-        <w:jc w:val="center"/>
-      </w:pPr>
-      <w:r>
-        <w:rPr>
-          <w:rFonts w:ascii="Times New Roman" w:hAnsi="Times New Roman"/>
-          <w:sz w:val="24"/>
-        </w:rPr>
-        <w:t>{{должность_дат}}</w:t>
-      </w:r>
-    </w:p>
-    <w:p>
-      <w:pPr>
-        <w:jc w:val="center"/>
-      </w:pPr>
-      <w:r>
-        <w:rPr>
-          <w:rFonts w:ascii="Times New Roman" w:hAnsi="Times New Roman"/>
-          <w:sz w:val="24"/>
-        </w:rPr>
-        <w:t>{{фио_дат}}</w:t>
-      </w:r>
-    </w:p>
-    <w:p/>
-    <w:p/>
-    <w:p>
-      <w:pPr>
-        <w:jc w:val="both"/>
-      </w:pPr>
-      <w:r>
-        <w:rPr>
-          <w:rFonts w:ascii="Times New Roman" w:hAnsi="Times New Roman"/>
-          <w:sz w:val="24"/>
-        </w:rPr>
-        <w:t xml:space="preserve">{{уважаемый}} </w:t>
+        <w:t xml:space="preserve">Важно: </w:t>
       </w:r>
       <w:r>
         <w:rPr>
           <w:rFonts w:ascii="Times New Roman" w:hAnsi="Times New Roman"/>
           <w:sz w:val="24"/>
         </w:rPr>
-        <w:t>{{имя_отчество}}!</w:t>
+        <w:t>Регистр данных в телеграмме будет соответствовать регистру в таблице Excel.</w:t>
       </w:r>
     </w:p>
-    <w:p/>
-    <w:p/>
     <w:p>
       <w:pPr>
+        <w:spacing w:after="0" w:before="0" w:line="276" w:lineRule="auto"/>
         <w:jc w:val="both"/>
       </w:pPr>
       <w:r>
         <w:rPr>
-          <w:rFonts w:ascii="Times New Roman" w:hAnsi="Times New Roman"/>
+          <w:rFonts w:ascii="Times New Roman" w:hAnsi="Times New Roman" w:eastAsia="Times New Roman"/>
+          <w:b w:val="0"/>
           <w:sz w:val="24"/>
         </w:rPr>
-        <w:t>Поздравляю Вас с Днём Победы!</w:t>
       </w:r>
     </w:p>
-    <w:p/>
     <w:p>
       <w:pPr>
+        <w:spacing w:after="0" w:before="0" w:line="276" w:lineRule="auto"/>
         <w:jc w:val="both"/>
       </w:pPr>
       <w:r>
         <w:rPr>
-          <w:rFonts w:ascii="Times New Roman" w:hAnsi="Times New Roman"/>
+          <w:rFonts w:ascii="Times New Roman" w:hAnsi="Times New Roman" w:eastAsia="Times New Roman"/>
+          <w:b w:val="0"/>
           <w:sz w:val="24"/>
         </w:rPr>
-        <w:t>Для всех нас этот праздник — дань священной памяти тем, кто ценой жизни и невероятных усилий отстоял независимость нашей страны. Это символ несгибаемой воли, сплочённости и любви к Родине.</w:t>
       </w:r>
-    </w:p>
-    <w:p/>
-    <w:p>
-      <w:pPr>
-        <w:jc w:val="both"/>
-      </w:pPr>
-      <w:r>
-        <w:rPr>
-          <w:rFonts w:ascii="Times New Roman" w:hAnsi="Times New Roman"/>
-          <w:sz w:val="24"/>
-        </w:rPr>
-        <w:t>Мы помним о великом подвиге народа и гордимся тем, что являемся наследниками победителей.</w:t>
-      </w:r>
-    </w:p>
-    <w:p/>
-    <w:p>
-      <w:pPr>
-        <w:jc w:val="both"/>
-      </w:pPr>
-      <w:r>
-        <w:rPr>
-          <w:rFonts w:ascii="Times New Roman" w:hAnsi="Times New Roman"/>
-          <w:sz w:val="24"/>
-        </w:rPr>
-        <w:t>Спасибо нашим ветеранам за мир, свободу и возможность строить будущее. Их подвиг живёт в наших сердцах, передаётся от отцов к детям и задаёт нравственные ориентиры для всей страны.</w:t>
-      </w:r>
-    </w:p>
-    <w:p/>
-    <w:p>
-      <w:pPr>
-        <w:jc w:val="both"/>
-      </w:pPr>
-      <w:r>
-        <w:rPr>
-          <w:rFonts w:ascii="Times New Roman" w:hAnsi="Times New Roman"/>
-          <w:sz w:val="24"/>
-        </w:rPr>
-        <w:t>Желаю Вам крепкого здоровья, счастья и благополучия! Пусть в каждом доме царит тепло, а память о Великой Победе всегда наполняет наши сердца гордостью!</w:t>
-      </w:r>
-    </w:p>
-    <w:p/>
-    <w:p/>
-    <w:p>
-      <w:pPr>
-        <w:jc w:val="both"/>
-      </w:pPr>
-      <w:r>
-        <w:rPr>
-          <w:rFonts w:ascii="Times New Roman" w:hAnsi="Times New Roman"/>
-          <w:sz w:val="24"/>
-        </w:rPr>
-        <w:t>С УВАЖЕНИЕМ,</w:t>
-      </w:r>
-    </w:p>
-    <w:p>
-      <w:pPr>
-        <w:jc w:val="both"/>
-      </w:pPr>
-      <w:r>
-        <w:rPr>
-          <w:rFonts w:ascii="Times New Roman" w:hAnsi="Times New Roman"/>
-          <w:b/>
-          <w:sz w:val="24"/>
-        </w:rPr>
-        <w:t>А. А. ВЕДЯХИН</w:t>
-      </w:r>
-    </w:p>
-    <w:p>
-      <w:pPr>
-        <w:jc w:val="both"/>
-      </w:pPr>
-      <w:r>
-        <w:rPr>
-          <w:rFonts w:ascii="Times New Roman" w:hAnsi="Times New Roman"/>
-          <w:sz w:val="24"/>
-        </w:rPr>
-        <w:t>ПЕРВЫЙ ЗАМЕСТИТЕЛЬ</w:t>
-        <w:br/>
-        <w:t>ПРЕДСЕДАТЕЛЯ ПРАВЛЕНИЯ</w:t>
-        <w:br/>
-        <w:t>ПАО СБЕРБАНК</w:t>
-      </w:r>
-    </w:p>
-    <w:p/>
-    <w:p>
-      <w:pPr>
-        <w:jc w:val="both"/>
-        <w:tabs>
-          <w:tab w:val="right" w:pos="9360"/>
-        </w:tabs>
-      </w:pPr>
-      <w:r>
-        <w:rPr>
-          <w:rFonts w:ascii="Times New Roman" w:hAnsi="Times New Roman"/>
-          <w:sz w:val="24"/>
-        </w:rPr>
-        <w:t>117997, Г. МОСКВА,</w:t>
-      </w:r>
-      <w:r>
-        <w:rPr>
-          <w:rFonts w:ascii="Times New Roman" w:hAnsi="Times New Roman"/>
-          <w:sz w:val="24"/>
-        </w:rPr>
-        <w:tab/>
-      </w:r>
-      <w:r>
-        <w:rPr>
-          <w:rFonts w:ascii="Times New Roman" w:hAnsi="Times New Roman"/>
-          <w:sz w:val="24"/>
-        </w:rPr>
-        <w:t>4 МАЯ 2026 ГОДА</w:t>
-      </w:r>
-    </w:p>
-    <w:p>
-      <w:pPr>
-        <w:jc w:val="both"/>
-      </w:pPr>
-      <w:r>
-        <w:rPr>
-          <w:rFonts w:ascii="Times New Roman" w:hAnsi="Times New Roman"/>
-          <w:sz w:val="24"/>
-        </w:rPr>
-        <w:t>УЛ. ВАВИЛОВА, Д. 19</w:t>
-      </w:r>
-    </w:p>
-    <w:p/>
-    <w:p>
-      <w:pPr>
-        <w:jc w:val="center"/>
-      </w:pPr>
-      <w:r>
-        <w:rPr>
-          <w:rFonts w:ascii="Times New Roman" w:hAnsi="Times New Roman"/>
-          <w:sz w:val="24"/>
-        </w:rPr>
-        <w:t>════════════════════════════════════════════════════════════</w:t>
-      </w:r>
-    </w:p>
-    <w:p>
-      <w:pPr>
-        <w:jc w:val="center"/>
-      </w:pPr>
-      <w:r>
-        <w:rPr>
-          <w:rFonts w:ascii="Times New Roman" w:hAnsi="Times New Roman"/>
-          <w:b/>
-          <w:i/>
-          <w:sz w:val="24"/>
-        </w:rPr>
-        <w:t>СПРАВКА ПО МЕТКАМ (удалите этот раздел перед использованием)</w:t>
-      </w:r>
-    </w:p>
-    <w:p/>
-    <w:p>
-      <w:pPr>
-        <w:jc w:val="both"/>
-      </w:pPr>
-      <w:r>
-        <w:rPr>
-          <w:rFonts w:ascii="Times New Roman" w:hAnsi="Times New Roman"/>
-          <w:sz w:val="24"/>
-        </w:rPr>
-        <w:t xml:space="preserve">Метка — это текст в двойных фигурных скобках: </w:t>
-      </w:r>
-      <w:r>
-        <w:rPr>
-          <w:rFonts w:ascii="Times New Roman" w:hAnsi="Times New Roman"/>
-          <w:b/>
-          <w:sz w:val="24"/>
-        </w:rPr>
-        <w:t>{{метка}}</w:t>
-      </w:r>
-      <w:r>
-        <w:rPr>
-          <w:rFonts w:ascii="Times New Roman" w:hAnsi="Times New Roman"/>
-          <w:sz w:val="24"/>
-        </w:rPr>
-        <w:t>. При генерации метка автоматически заменится на данные из таблицы.</w:t>
-      </w:r>
-    </w:p>
-    <w:p/>
-    <w:tbl>
-      <w:tblPr>
-        <w:tblStyle w:val="TableGrid"/>
-        <w:tblW w:type="auto" w:w="0"/>
-        <w:tblLook w:firstColumn="1" w:firstRow="1" w:lastColumn="0" w:lastRow="0" w:noHBand="0" w:noVBand="1" w:val="04A0"/>
-      </w:tblPr>
-      <w:tblGrid>
-        <w:gridCol w:w="3230"/>
-        <w:gridCol w:w="3230"/>
-        <w:gridCol w:w="3230"/>
-      </w:tblGrid>
-      <w:tr>
-        <w:tc>
-          <w:tcPr>
-            <w:tcW w:type="dxa" w:w="3230"/>
-          </w:tcPr>
-          <w:p>
-            <w:r>
-              <w:rPr>
-                <w:rFonts w:ascii="Times New Roman" w:hAnsi="Times New Roman"/>
-                <w:b/>
-                <w:sz w:val="20"/>
-              </w:rPr>
-              <w:t>Метка</w:t>
-            </w:r>
-          </w:p>
-        </w:tc>
-        <w:tc>
-          <w:tcPr>
-            <w:tcW w:type="dxa" w:w="3230"/>
-          </w:tcPr>
-          <w:p>
-            <w:r>
-              <w:rPr>
-                <w:rFonts w:ascii="Times New Roman" w:hAnsi="Times New Roman"/>
-                <w:b/>
-                <w:sz w:val="20"/>
-              </w:rPr>
-              <w:t>Что подставится</w:t>
-            </w:r>
-          </w:p>
-        </w:tc>
-        <w:tc>
-          <w:tcPr>
-            <w:tcW w:type="dxa" w:w="3230"/>
-          </w:tcPr>
-          <w:p>
-            <w:r>
-              <w:rPr>
-                <w:rFonts w:ascii="Times New Roman" w:hAnsi="Times New Roman"/>
-                <w:b/>
-                <w:sz w:val="20"/>
-              </w:rPr>
-              <w:t>Пример результата</w:t>
-            </w:r>
-          </w:p>
-        </w:tc>
-      </w:tr>
-      <w:tr>
-        <w:tc>
-          <w:tcPr>
-            <w:tcW w:type="dxa" w:w="3230"/>
-          </w:tcPr>
-          <w:p>
-            <w:r>
-              <w:rPr>
-                <w:rFonts w:ascii="Times New Roman" w:hAnsi="Times New Roman"/>
-                <w:sz w:val="20"/>
-              </w:rPr>
-              <w:t>{{адрес}}</w:t>
-            </w:r>
-          </w:p>
-        </w:tc>
-        <w:tc>
-          <w:tcPr>
-            <w:tcW w:type="dxa" w:w="3230"/>
-          </w:tcPr>
-          <w:p>
-            <w:r>
-              <w:rPr>
-                <w:rFonts w:ascii="Times New Roman" w:hAnsi="Times New Roman"/>
-                <w:sz w:val="20"/>
-              </w:rPr>
-              <w:t>Адрес получателя</w:t>
-            </w:r>
-          </w:p>
-        </w:tc>
-        <w:tc>
-          <w:tcPr>
-            <w:tcW w:type="dxa" w:w="3230"/>
-          </w:tcPr>
-          <w:p>
-            <w:r>
-              <w:rPr>
-                <w:rFonts w:ascii="Times New Roman" w:hAnsi="Times New Roman"/>
-                <w:sz w:val="20"/>
-              </w:rPr>
-              <w:t>107996, Г. МОСКВА, УЛ. ЩЕПКИНА, Д. 42</w:t>
-            </w:r>
-          </w:p>
-        </w:tc>
-      </w:tr>
-      <w:tr>
-        <w:tc>
-          <w:tcPr>
-            <w:tcW w:type="dxa" w:w="3230"/>
-          </w:tcPr>
-          <w:p>
-            <w:r>
-              <w:rPr>
-                <w:rFonts w:ascii="Times New Roman" w:hAnsi="Times New Roman"/>
-                <w:sz w:val="20"/>
-              </w:rPr>
-              <w:t>{{организация}}</w:t>
-            </w:r>
-          </w:p>
-        </w:tc>
-        <w:tc>
-          <w:tcPr>
-            <w:tcW w:type="dxa" w:w="3230"/>
-          </w:tcPr>
-          <w:p>
-            <w:r>
-              <w:rPr>
-                <w:rFonts w:ascii="Times New Roman" w:hAnsi="Times New Roman"/>
-                <w:sz w:val="20"/>
-              </w:rPr>
-              <w:t>Название организации</w:t>
-            </w:r>
-          </w:p>
-        </w:tc>
-        <w:tc>
-          <w:tcPr>
-            <w:tcW w:type="dxa" w:w="3230"/>
-          </w:tcPr>
-          <w:p>
-            <w:r>
-              <w:rPr>
-                <w:rFonts w:ascii="Times New Roman" w:hAnsi="Times New Roman"/>
-                <w:sz w:val="20"/>
-              </w:rPr>
-              <w:t>ГОСКОРПОРАЦИЯ «РОСКОСМОС»</w:t>
-            </w:r>
-          </w:p>
-        </w:tc>
-      </w:tr>
-      <w:tr>
-        <w:tc>
-          <w:tcPr>
-            <w:tcW w:type="dxa" w:w="3230"/>
-          </w:tcPr>
-          <w:p>
-            <w:r>
-              <w:rPr>
-                <w:rFonts w:ascii="Times New Roman" w:hAnsi="Times New Roman"/>
-                <w:sz w:val="20"/>
-              </w:rPr>
-              <w:t>{{должность_дат}}</w:t>
-            </w:r>
-          </w:p>
-        </w:tc>
-        <w:tc>
-          <w:tcPr>
-            <w:tcW w:type="dxa" w:w="3230"/>
-          </w:tcPr>
-          <w:p>
-            <w:r>
-              <w:rPr>
-                <w:rFonts w:ascii="Times New Roman" w:hAnsi="Times New Roman"/>
-                <w:sz w:val="20"/>
-              </w:rPr>
-              <w:t>Должность (дат. падеж)</w:t>
-            </w:r>
-          </w:p>
-        </w:tc>
-        <w:tc>
-          <w:tcPr>
-            <w:tcW w:type="dxa" w:w="3230"/>
-          </w:tcPr>
-          <w:p>
-            <w:r>
-              <w:rPr>
-                <w:rFonts w:ascii="Times New Roman" w:hAnsi="Times New Roman"/>
-                <w:sz w:val="20"/>
-              </w:rPr>
-              <w:t>ГЕНЕРАЛЬНОМУ ДИРЕКТОРУ</w:t>
-            </w:r>
-          </w:p>
-        </w:tc>
-      </w:tr>
-      <w:tr>
-        <w:tc>
-          <w:tcPr>
-            <w:tcW w:type="dxa" w:w="3230"/>
-          </w:tcPr>
-          <w:p>
-            <w:r>
-              <w:rPr>
-                <w:rFonts w:ascii="Times New Roman" w:hAnsi="Times New Roman"/>
-                <w:sz w:val="20"/>
-              </w:rPr>
-              <w:t>{{фио_дат}}</w:t>
-            </w:r>
-          </w:p>
-        </w:tc>
-        <w:tc>
-          <w:tcPr>
-            <w:tcW w:type="dxa" w:w="3230"/>
-          </w:tcPr>
-          <w:p>
-            <w:r>
-              <w:rPr>
-                <w:rFonts w:ascii="Times New Roman" w:hAnsi="Times New Roman"/>
-                <w:sz w:val="20"/>
-              </w:rPr>
-              <w:t>ФИО (дат. падеж)</w:t>
-            </w:r>
-          </w:p>
-        </w:tc>
-        <w:tc>
-          <w:tcPr>
-            <w:tcW w:type="dxa" w:w="3230"/>
-          </w:tcPr>
-          <w:p>
-            <w:r>
-              <w:rPr>
-                <w:rFonts w:ascii="Times New Roman" w:hAnsi="Times New Roman"/>
-                <w:sz w:val="20"/>
-              </w:rPr>
-              <w:t>БАКАНОВУ ДМИТРИЮ ВЛАДИМИРОВИЧУ</w:t>
-            </w:r>
-          </w:p>
-        </w:tc>
-      </w:tr>
-      <w:tr>
-        <w:tc>
-          <w:tcPr>
-            <w:tcW w:type="dxa" w:w="3230"/>
-          </w:tcPr>
-          <w:p>
-            <w:r>
-              <w:rPr>
-                <w:rFonts w:ascii="Times New Roman" w:hAnsi="Times New Roman"/>
-                <w:sz w:val="20"/>
-              </w:rPr>
-              <w:t>{{имя_отчество}}</w:t>
-            </w:r>
-          </w:p>
-        </w:tc>
-        <w:tc>
-          <w:tcPr>
-            <w:tcW w:type="dxa" w:w="3230"/>
-          </w:tcPr>
-          <w:p>
-            <w:r>
-              <w:rPr>
-                <w:rFonts w:ascii="Times New Roman" w:hAnsi="Times New Roman"/>
-                <w:sz w:val="20"/>
-              </w:rPr>
-              <w:t>Имя и отчество</w:t>
-            </w:r>
-          </w:p>
-        </w:tc>
-        <w:tc>
-          <w:tcPr>
-            <w:tcW w:type="dxa" w:w="3230"/>
-          </w:tcPr>
-          <w:p>
-            <w:r>
-              <w:rPr>
-                <w:rFonts w:ascii="Times New Roman" w:hAnsi="Times New Roman"/>
-                <w:sz w:val="20"/>
-              </w:rPr>
-              <w:t>ДМИТРИЙ ВЛАДИМИРОВИЧ</w:t>
-            </w:r>
-          </w:p>
-        </w:tc>
-      </w:tr>
-      <w:tr>
-        <w:tc>
-          <w:tcPr>
-            <w:tcW w:type="dxa" w:w="3230"/>
-          </w:tcPr>
-          <w:p>
-            <w:r>
-              <w:rPr>
-                <w:rFonts w:ascii="Times New Roman" w:hAnsi="Times New Roman"/>
-                <w:sz w:val="20"/>
-              </w:rPr>
-              <w:t>{{уважаемый}}</w:t>
-            </w:r>
-          </w:p>
-        </w:tc>
-        <w:tc>
-          <w:tcPr>
-            <w:tcW w:type="dxa" w:w="3230"/>
-          </w:tcPr>
-          <w:p>
-            <w:r>
-              <w:rPr>
-                <w:rFonts w:ascii="Times New Roman" w:hAnsi="Times New Roman"/>
-                <w:sz w:val="20"/>
-              </w:rPr>
-              <w:t>Приветствие (по полу)</w:t>
-            </w:r>
-          </w:p>
-        </w:tc>
-        <w:tc>
-          <w:tcPr>
-            <w:tcW w:type="dxa" w:w="3230"/>
-          </w:tcPr>
-          <w:p>
-            <w:r>
-              <w:rPr>
-                <w:rFonts w:ascii="Times New Roman" w:hAnsi="Times New Roman"/>
-                <w:sz w:val="20"/>
-              </w:rPr>
-              <w:t>УВАЖАЕМЫЙ / УВАЖАЕМАЯ</w:t>
-            </w:r>
-          </w:p>
-        </w:tc>
-      </w:tr>
-    </w:tbl>
-    <w:p/>
-    <w:p>
-      <w:pPr>
-        <w:jc w:val="both"/>
-      </w:pPr>
       <w:r>
         <w:rPr>
           <w:rFonts w:ascii="Times New Roman" w:hAnsi="Times New Roman"/>
@@ -640,15 +510,14 @@
       <w:r>
         <w:rPr>
           <w:rFonts w:ascii="Times New Roman" w:hAnsi="Times New Roman"/>
-          <w:i/>
           <w:sz w:val="24"/>
         </w:rPr>
-        <w:t>Измените текст поздравления выше, но не трогайте метки в фигурных скобках. Удалите эту справку перед отправкой на генерацию.</w:t>
+        <w:t>Измените текст поздравления на нужный вам. Главное — сохраните структуру данных в Excel.</w:t>
       </w:r>
     </w:p>
     <w:sectPr>
       <w:pgSz w:w="12240" w:h="15840"/>
-      <w:pgMar w:top="1134" w:right="850" w:bottom="1134" w:left="1701" w:header="720" w:footer="720" w:gutter="0"/>
+      <w:pgMar w:top="850" w:right="1134" w:bottom="1134" w:left="1701" w:header="720" w:footer="720" w:gutter="0"/>
       <w:cols w:space="720"/>
       <w:docGrid w:linePitch="360"/>
     </w:sectPr>
@@ -1019,13 +888,6 @@
     <w:name w:val="Normal"/>
     <w:qFormat/>
     <w:rsid w:val="00FC693F"/>
-    <w:pPr>
-      <w:spacing w:line="240" w:lineRule="auto" w:after="0"/>
-    </w:pPr>
-    <w:rPr>
-      <w:rFonts w:ascii="Times New Roman" w:hAnsi="Times New Roman"/>
-      <w:sz w:val="24"/>
-    </w:rPr>
   </w:style>
   <w:style w:type="paragraph" w:styleId="Header">
     <w:name w:val="header"/>

</xml_diff>